<commit_message>
feat: ph3 - Auth
</commit_message>
<xml_diff>
--- a/phase-plan.docx
+++ b/phase-plan.docx
@@ -166,13 +166,31 @@
       <w:r>
         <w:br/>
       </w:r>
-      <w:r>
-        <w:rPr>
-          <w:b/>
-          <w:bCs/>
-        </w:rPr>
-        <w:t>Quinfosys™ QuDrugForge</w:t>
-      </w:r>
+      <w:proofErr w:type="spellStart"/>
+      <w:r>
+        <w:rPr>
+          <w:b/>
+          <w:bCs/>
+        </w:rPr>
+        <w:t>Quinfosys</w:t>
+      </w:r>
+      <w:proofErr w:type="spellEnd"/>
+      <w:r>
+        <w:rPr>
+          <w:b/>
+          <w:bCs/>
+        </w:rPr>
+        <w:t xml:space="preserve">™ </w:t>
+      </w:r>
+      <w:proofErr w:type="spellStart"/>
+      <w:r>
+        <w:rPr>
+          <w:b/>
+          <w:bCs/>
+        </w:rPr>
+        <w:t>QuDrugForge</w:t>
+      </w:r>
+      <w:proofErr w:type="spellEnd"/>
     </w:p>
     <w:p>
       <w:pPr>
@@ -303,7 +321,25 @@
           <w:b/>
           <w:bCs/>
         </w:rPr>
-        <w:t xml:space="preserve"> – CHECK THE “page arch.word”</w:t>
+        <w:t xml:space="preserve"> – CHECK THE “page </w:t>
+      </w:r>
+      <w:proofErr w:type="spellStart"/>
+      <w:proofErr w:type="gramStart"/>
+      <w:r>
+        <w:rPr>
+          <w:b/>
+          <w:bCs/>
+        </w:rPr>
+        <w:t>arch.word</w:t>
+      </w:r>
+      <w:proofErr w:type="spellEnd"/>
+      <w:proofErr w:type="gramEnd"/>
+      <w:r>
+        <w:rPr>
+          <w:b/>
+          <w:bCs/>
+        </w:rPr>
+        <w:t>”</w:t>
       </w:r>
     </w:p>
     <w:p>
@@ -658,8 +694,13 @@
     <w:p>
       <w:r>
         <w:lastRenderedPageBreak/>
-        <w:t>/app</w:t>
-      </w:r>
+        <w:t>/</w:t>
+      </w:r>
+      <w:proofErr w:type="gramStart"/>
+      <w:r>
+        <w:t>app</w:t>
+      </w:r>
+      <w:proofErr w:type="gramEnd"/>
     </w:p>
     <w:p>
       <w:r>
@@ -1234,6 +1275,9 @@
       <w:r>
         <w:t>Quantum Validation</w:t>
       </w:r>
+      <w:r>
+        <w:tab/>
+      </w:r>
     </w:p>
     <w:p>
       <w:r>
@@ -1852,7 +1896,15 @@
         </w:numPr>
       </w:pPr>
       <w:r>
-        <w:t>Distribution (MW, LogP)</w:t>
+        <w:t xml:space="preserve">Distribution (MW, </w:t>
+      </w:r>
+      <w:proofErr w:type="spellStart"/>
+      <w:r>
+        <w:t>LogP</w:t>
+      </w:r>
+      <w:proofErr w:type="spellEnd"/>
+      <w:r>
+        <w:t>)</w:t>
       </w:r>
     </w:p>
     <w:p>
@@ -2114,9 +2166,11 @@
           <w:numId w:val="23"/>
         </w:numPr>
       </w:pPr>
+      <w:proofErr w:type="spellStart"/>
       <w:r>
         <w:t>LogP</w:t>
       </w:r>
+      <w:proofErr w:type="spellEnd"/>
     </w:p>
     <w:p>
       <w:pPr>

</xml_diff>